<commit_message>
Update resume: target role, projects, remove placeholders
</commit_message>
<xml_diff>
--- a/王忠毅_个人简历.docx
+++ b/王忠毅_个人简历.docx
@@ -39,7 +39,7 @@
           </w:p>
           <w:p>
             <w:r>
-              <w:t>求职意向  待明确目标岗位</w:t>
+              <w:t>求职意向  前端开发实习生 / AI 应用开发实习生</w:t>
             </w:r>
           </w:p>
           <w:p>
@@ -92,7 +92,7 @@
     </w:p>
     <w:p>
       <w:r>
-        <w:t>南京财经大学在校生，2024 年入学，学习方向为计算机与人工智能。当前简历以教育背景为主，后续将根据目标岗位补充课程实践、技能与作品。</w:t>
+        <w:t>南京财经大学计算机与人工智能专业本科在读，2024 年入学。习惯用原生 HTML、CSS、JavaScript 把想法做成可以直接打开使用的网页应用，已独立完成 AI 行业日报、个人作品集及三个小工具并全部在线部署，关注交互细节、可读性与无障碍。寻找前端或 AI 应用方向的实习机会。</w:t>
       </w:r>
     </w:p>
     <w:p>
@@ -119,12 +119,7 @@
     </w:p>
     <w:p>
       <w:r>
-        <w:t>学历层次：待确认    毕业时间：待确认</w:t>
-      </w:r>
-    </w:p>
-    <w:p>
-      <w:r>
-        <w:t>核心课程：待补充已修课程；GPA、排名仅在确认后填写。</w:t>
+        <w:t>学历层次：本科    毕业时间：预计 2028 年</w:t>
       </w:r>
     </w:p>
     <w:p>
@@ -138,17 +133,7 @@
     </w:p>
     <w:p>
       <w:r>
-        <w:t xml:space="preserve">编程与开发：原生 HTML、CSS、JavaScript，内联 SVG，localStorage；用 AI 工具辅助开发。</w:t>
-      </w:r>
-    </w:p>
-    <w:p>
-      <w:r>
-        <w:t>数据与办公：待补充实际使用过的软件及具体任务。</w:t>
-      </w:r>
-    </w:p>
-    <w:p>
-      <w:r>
-        <w:t>语言与证书：暂无已提供的证书信息。</w:t>
+        <w:t>前端开发：原生 HTML、CSS、JavaScript，响应式布局，内联 SVG 图表，localStorage 本地存储；会用 AI 工具辅助开发与调试。</w:t>
       </w:r>
     </w:p>
     <w:p>
@@ -183,38 +168,25 @@
     </w:p>
     <w:p>
       <w:r>
-        <w:t xml:space="preserve">同样为原生单文件，含命令面板、作品版本演化预览、打印样式、深浅主题，以及按可用性原则整理的交互设计依据。</w:t>
-      </w:r>
-    </w:p>
-    <w:p>
-      <w:r>
-        <w:t xml:space="preserve">在线地址：https://wangzhongyi-portfolio.app.workbuddy.host/</w:t>
-      </w:r>
-    </w:p>
-    <w:p>
-      <w:pPr>
-        <w:pStyle w:val="Heading1"/>
-        <w:keepNext/>
-      </w:pPr>
-      <w:r>
-        <w:t>荣誉与校园经历</w:t>
-      </w:r>
-    </w:p>
-    <w:p>
-      <w:r>
-        <w:t>暂无已提供的获奖或校园实践信息。</w:t>
-      </w:r>
-    </w:p>
-    <w:p>
-      <w:pPr>
-        <w:spacing w:before="360"/>
-      </w:pPr>
+        <w:t>同样为原生单文件，含命令面板、作品版本演化预览、打印样式、深浅主题，以及按可用性原则整理的交互设计依据。部署于 GitHub Pages。</w:t>
+      </w:r>
+    </w:p>
+    <w:p>
+      <w:r>
+        <w:t>在线地址：https://zhimu666.github.io/</w:t>
+      </w:r>
+    </w:p>
+    <w:p>
       <w:r>
         <w:rPr>
-          <w:color w:val="6D7B8E"/>
-          <w:sz w:val="18"/>
+          <w:b/>
         </w:rPr>
-        <w:t>待完善稿  ｜  投递前请补齐目标岗位、学历及技能，删除未使用的待填写项。</w:t>
+        <w:t>绩点计算器 / 专注台 / 课表（个人提需求与测试，AI 辅助开发）</w:t>
+      </w:r>
+    </w:p>
+    <w:p>
+      <w:r>
+        <w:t>三个面向大学生活的单文件小应用：绩点计算器支持两种折算规则并可按目标绩点反推剩余课程要求；专注台为任务清单加番茄钟，倒计时按结束时刻计算；课表支持单双周、时间冲突检测与导出导入。均在线可用：https://zhimu666.github.io/#tools</w:t>
       </w:r>
     </w:p>
     <w:sectPr>

</xml_diff>

<commit_message>
Resume: remove education dates
</commit_message>
<xml_diff>
--- a/王忠毅_个人简历.docx
+++ b/王忠毅_个人简历.docx
@@ -154,16 +154,6 @@
           <w:sz w:val="19"/>
         </w:rPr>
         <w:t xml:space="preserve">  |  计算机科学与技术  ·  本科</w:t>
-      </w:r>
-      <w:r>
-        <w:rPr>
-          <w:rFonts w:ascii="微软雅黑" w:hAnsi="微软雅黑" w:eastAsia="微软雅黑"/>
-          <w:b w:val="0"/>
-          <w:color w:val="555148"/>
-          <w:sz w:val="19"/>
-        </w:rPr>
-        <w:tab/>
-        <w:t>2024.09 – 至今</w:t>
       </w:r>
     </w:p>
     <w:p>

</xml_diff>